<commit_message>
Add English report mode
</commit_message>
<xml_diff>
--- a/templates/sql_healthcheck_master.docx
+++ b/templates/sql_healthcheck_master.docx
@@ -629,27 +629,7 @@
                 <w:sz w:val="26"/>
                 <w:szCs w:val="26"/>
               </w:rPr>
-              <w:t>{{</w:t>
-            </w:r>
-            <w:proofErr w:type="spellStart"/>
-            <w:r>
-              <w:rPr>
-                <w:rFonts w:cstheme="minorHAnsi"/>
-                <w:b/>
-                <w:sz w:val="26"/>
-                <w:szCs w:val="26"/>
-              </w:rPr>
-              <w:t>collection_date</w:t>
-            </w:r>
-            <w:proofErr w:type="spellEnd"/>
-            <w:r>
-              <w:rPr>
-                <w:rFonts w:cstheme="minorHAnsi"/>
-                <w:b/>
-                <w:sz w:val="26"/>
-                <w:szCs w:val="26"/>
-              </w:rPr>
-              <w:t>}}</w:t>
+              <w:t>{{collection_date}}</w:t>
             </w:r>
           </w:p>
         </w:tc>
@@ -2544,41 +2524,13 @@
           <w:szCs w:val="26"/>
         </w:rPr>
       </w:pPr>
-      <w:proofErr w:type="spellStart"/>
       <w:r>
         <w:rPr>
           <w:rFonts w:cstheme="minorHAnsi"/>
           <w:sz w:val="26"/>
           <w:szCs w:val="26"/>
         </w:rPr>
-        <w:t>Tác</w:t>
-      </w:r>
-      <w:proofErr w:type="spellEnd"/>
-      <w:r>
-        <w:rPr>
-          <w:rFonts w:cstheme="minorHAnsi"/>
-          <w:sz w:val="26"/>
-          <w:szCs w:val="26"/>
-        </w:rPr>
-        <w:t xml:space="preserve"> </w:t>
-      </w:r>
-      <w:proofErr w:type="spellStart"/>
-      <w:r>
-        <w:rPr>
-          <w:rFonts w:cstheme="minorHAnsi"/>
-          <w:sz w:val="26"/>
-          <w:szCs w:val="26"/>
-        </w:rPr>
-        <w:t>giả</w:t>
-      </w:r>
-      <w:proofErr w:type="spellEnd"/>
-      <w:r>
-        <w:rPr>
-          <w:rFonts w:cstheme="minorHAnsi"/>
-          <w:sz w:val="26"/>
-          <w:szCs w:val="26"/>
-        </w:rPr>
-        <w:t>:</w:t>
+        <w:t>Tác giả:</w:t>
       </w:r>
     </w:p>
     <w:tbl>
@@ -2693,33 +2645,15 @@
                 <w:sz w:val="26"/>
                 <w:szCs w:val="26"/>
               </w:rPr>
-              <w:t>{{creator</w:t>
-            </w:r>
-            <w:proofErr w:type="gramStart"/>
+              <w:t>{{creator}}</w:t>
+            </w:r>
             <w:r>
               <w:rPr>
                 <w:rFonts w:cstheme="minorHAnsi"/>
                 <w:sz w:val="26"/>
                 <w:szCs w:val="26"/>
               </w:rPr>
-              <w:t>}}</w:t>
-            </w:r>
-            <w:r>
-              <w:rPr>
-                <w:rFonts w:cstheme="minorHAnsi"/>
-                <w:sz w:val="26"/>
-                <w:szCs w:val="26"/>
-              </w:rPr>
-              <w:t xml:space="preserve">   </w:t>
-            </w:r>
-            <w:proofErr w:type="gramEnd"/>
-            <w:r>
-              <w:rPr>
-                <w:rFonts w:cstheme="minorHAnsi"/>
-                <w:sz w:val="26"/>
-                <w:szCs w:val="26"/>
-              </w:rPr>
-              <w:t xml:space="preserve">            </w:t>
+              <w:t xml:space="preserve">               </w:t>
             </w:r>
           </w:p>
         </w:tc>
@@ -2774,41 +2708,13 @@
           <w:szCs w:val="26"/>
         </w:rPr>
       </w:pPr>
-      <w:proofErr w:type="spellStart"/>
       <w:r>
         <w:rPr>
           <w:rFonts w:cstheme="minorHAnsi"/>
           <w:sz w:val="26"/>
           <w:szCs w:val="26"/>
         </w:rPr>
-        <w:t>Giám</w:t>
-      </w:r>
-      <w:proofErr w:type="spellEnd"/>
-      <w:r>
-        <w:rPr>
-          <w:rFonts w:cstheme="minorHAnsi"/>
-          <w:sz w:val="26"/>
-          <w:szCs w:val="26"/>
-        </w:rPr>
-        <w:t xml:space="preserve"> </w:t>
-      </w:r>
-      <w:proofErr w:type="spellStart"/>
-      <w:r>
-        <w:rPr>
-          <w:rFonts w:cstheme="minorHAnsi"/>
-          <w:sz w:val="26"/>
-          <w:szCs w:val="26"/>
-        </w:rPr>
-        <w:t>sát</w:t>
-      </w:r>
-      <w:proofErr w:type="spellEnd"/>
-      <w:r>
-        <w:rPr>
-          <w:rFonts w:cstheme="minorHAnsi"/>
-          <w:sz w:val="26"/>
-          <w:szCs w:val="26"/>
-        </w:rPr>
-        <w:t>:</w:t>
+        <w:t>Giám sát:</w:t>
       </w:r>
     </w:p>
     <w:tbl>
@@ -3028,7 +2934,6 @@
           <w:szCs w:val="26"/>
         </w:rPr>
       </w:pPr>
-      <w:proofErr w:type="spellStart"/>
       <w:r>
         <w:rPr>
           <w:rFonts w:cstheme="minorHAnsi"/>
@@ -3036,9 +2941,8 @@
           <w:sz w:val="26"/>
           <w:szCs w:val="26"/>
         </w:rPr>
-        <w:t>Tại</w:t>
+        <w:t>Tại thời điểm theo dõi hệ thống, chưa có phát hiện các hiện tượng thắt nút cổ chai, các database hoạt động đọ</w:t>
       </w:r>
-      <w:proofErr w:type="spellEnd"/>
       <w:r>
         <w:rPr>
           <w:rFonts w:cstheme="minorHAnsi"/>
@@ -3046,468 +2950,8 @@
           <w:sz w:val="26"/>
           <w:szCs w:val="26"/>
         </w:rPr>
-        <w:t xml:space="preserve"> </w:t>
+        <w:t>c/ghi bình thường</w:t>
       </w:r>
-      <w:proofErr w:type="spellStart"/>
-      <w:r>
-        <w:rPr>
-          <w:rFonts w:cstheme="minorHAnsi"/>
-          <w:color w:val="000000"/>
-          <w:sz w:val="26"/>
-          <w:szCs w:val="26"/>
-        </w:rPr>
-        <w:t>thời</w:t>
-      </w:r>
-      <w:proofErr w:type="spellEnd"/>
-      <w:r>
-        <w:rPr>
-          <w:rFonts w:cstheme="minorHAnsi"/>
-          <w:color w:val="000000"/>
-          <w:sz w:val="26"/>
-          <w:szCs w:val="26"/>
-        </w:rPr>
-        <w:t xml:space="preserve"> </w:t>
-      </w:r>
-      <w:proofErr w:type="spellStart"/>
-      <w:r>
-        <w:rPr>
-          <w:rFonts w:cstheme="minorHAnsi"/>
-          <w:color w:val="000000"/>
-          <w:sz w:val="26"/>
-          <w:szCs w:val="26"/>
-        </w:rPr>
-        <w:t>điểm</w:t>
-      </w:r>
-      <w:proofErr w:type="spellEnd"/>
-      <w:r>
-        <w:rPr>
-          <w:rFonts w:cstheme="minorHAnsi"/>
-          <w:color w:val="000000"/>
-          <w:sz w:val="26"/>
-          <w:szCs w:val="26"/>
-        </w:rPr>
-        <w:t xml:space="preserve"> </w:t>
-      </w:r>
-      <w:proofErr w:type="spellStart"/>
-      <w:r>
-        <w:rPr>
-          <w:rFonts w:cstheme="minorHAnsi"/>
-          <w:color w:val="000000"/>
-          <w:sz w:val="26"/>
-          <w:szCs w:val="26"/>
-        </w:rPr>
-        <w:t>theo</w:t>
-      </w:r>
-      <w:proofErr w:type="spellEnd"/>
-      <w:r>
-        <w:rPr>
-          <w:rFonts w:cstheme="minorHAnsi"/>
-          <w:color w:val="000000"/>
-          <w:sz w:val="26"/>
-          <w:szCs w:val="26"/>
-        </w:rPr>
-        <w:t xml:space="preserve"> </w:t>
-      </w:r>
-      <w:proofErr w:type="spellStart"/>
-      <w:r>
-        <w:rPr>
-          <w:rFonts w:cstheme="minorHAnsi"/>
-          <w:color w:val="000000"/>
-          <w:sz w:val="26"/>
-          <w:szCs w:val="26"/>
-        </w:rPr>
-        <w:t>dõi</w:t>
-      </w:r>
-      <w:proofErr w:type="spellEnd"/>
-      <w:r>
-        <w:rPr>
-          <w:rFonts w:cstheme="minorHAnsi"/>
-          <w:color w:val="000000"/>
-          <w:sz w:val="26"/>
-          <w:szCs w:val="26"/>
-        </w:rPr>
-        <w:t xml:space="preserve"> </w:t>
-      </w:r>
-      <w:proofErr w:type="spellStart"/>
-      <w:r>
-        <w:rPr>
-          <w:rFonts w:cstheme="minorHAnsi"/>
-          <w:color w:val="000000"/>
-          <w:sz w:val="26"/>
-          <w:szCs w:val="26"/>
-        </w:rPr>
-        <w:t>hệ</w:t>
-      </w:r>
-      <w:proofErr w:type="spellEnd"/>
-      <w:r>
-        <w:rPr>
-          <w:rFonts w:cstheme="minorHAnsi"/>
-          <w:color w:val="000000"/>
-          <w:sz w:val="26"/>
-          <w:szCs w:val="26"/>
-        </w:rPr>
-        <w:t xml:space="preserve"> </w:t>
-      </w:r>
-      <w:proofErr w:type="spellStart"/>
-      <w:r>
-        <w:rPr>
-          <w:rFonts w:cstheme="minorHAnsi"/>
-          <w:color w:val="000000"/>
-          <w:sz w:val="26"/>
-          <w:szCs w:val="26"/>
-        </w:rPr>
-        <w:t>thống</w:t>
-      </w:r>
-      <w:proofErr w:type="spellEnd"/>
-      <w:r>
-        <w:rPr>
-          <w:rFonts w:cstheme="minorHAnsi"/>
-          <w:color w:val="000000"/>
-          <w:sz w:val="26"/>
-          <w:szCs w:val="26"/>
-        </w:rPr>
-        <w:t xml:space="preserve">, </w:t>
-      </w:r>
-      <w:proofErr w:type="spellStart"/>
-      <w:r>
-        <w:rPr>
-          <w:rFonts w:cstheme="minorHAnsi"/>
-          <w:color w:val="000000"/>
-          <w:sz w:val="26"/>
-          <w:szCs w:val="26"/>
-        </w:rPr>
-        <w:t>chưa</w:t>
-      </w:r>
-      <w:proofErr w:type="spellEnd"/>
-      <w:r>
-        <w:rPr>
-          <w:rFonts w:cstheme="minorHAnsi"/>
-          <w:color w:val="000000"/>
-          <w:sz w:val="26"/>
-          <w:szCs w:val="26"/>
-        </w:rPr>
-        <w:t xml:space="preserve"> </w:t>
-      </w:r>
-      <w:proofErr w:type="spellStart"/>
-      <w:r>
-        <w:rPr>
-          <w:rFonts w:cstheme="minorHAnsi"/>
-          <w:color w:val="000000"/>
-          <w:sz w:val="26"/>
-          <w:szCs w:val="26"/>
-        </w:rPr>
-        <w:t>có</w:t>
-      </w:r>
-      <w:proofErr w:type="spellEnd"/>
-      <w:r>
-        <w:rPr>
-          <w:rFonts w:cstheme="minorHAnsi"/>
-          <w:color w:val="000000"/>
-          <w:sz w:val="26"/>
-          <w:szCs w:val="26"/>
-        </w:rPr>
-        <w:t xml:space="preserve"> </w:t>
-      </w:r>
-      <w:proofErr w:type="spellStart"/>
-      <w:r>
-        <w:rPr>
-          <w:rFonts w:cstheme="minorHAnsi"/>
-          <w:color w:val="000000"/>
-          <w:sz w:val="26"/>
-          <w:szCs w:val="26"/>
-        </w:rPr>
-        <w:t>phát</w:t>
-      </w:r>
-      <w:proofErr w:type="spellEnd"/>
-      <w:r>
-        <w:rPr>
-          <w:rFonts w:cstheme="minorHAnsi"/>
-          <w:color w:val="000000"/>
-          <w:sz w:val="26"/>
-          <w:szCs w:val="26"/>
-        </w:rPr>
-        <w:t xml:space="preserve"> </w:t>
-      </w:r>
-      <w:proofErr w:type="spellStart"/>
-      <w:r>
-        <w:rPr>
-          <w:rFonts w:cstheme="minorHAnsi"/>
-          <w:color w:val="000000"/>
-          <w:sz w:val="26"/>
-          <w:szCs w:val="26"/>
-        </w:rPr>
-        <w:t>hiện</w:t>
-      </w:r>
-      <w:proofErr w:type="spellEnd"/>
-      <w:r>
-        <w:rPr>
-          <w:rFonts w:cstheme="minorHAnsi"/>
-          <w:color w:val="000000"/>
-          <w:sz w:val="26"/>
-          <w:szCs w:val="26"/>
-        </w:rPr>
-        <w:t xml:space="preserve"> </w:t>
-      </w:r>
-      <w:proofErr w:type="spellStart"/>
-      <w:r>
-        <w:rPr>
-          <w:rFonts w:cstheme="minorHAnsi"/>
-          <w:color w:val="000000"/>
-          <w:sz w:val="26"/>
-          <w:szCs w:val="26"/>
-        </w:rPr>
-        <w:t>các</w:t>
-      </w:r>
-      <w:proofErr w:type="spellEnd"/>
-      <w:r>
-        <w:rPr>
-          <w:rFonts w:cstheme="minorHAnsi"/>
-          <w:color w:val="000000"/>
-          <w:sz w:val="26"/>
-          <w:szCs w:val="26"/>
-        </w:rPr>
-        <w:t xml:space="preserve"> </w:t>
-      </w:r>
-      <w:proofErr w:type="spellStart"/>
-      <w:r>
-        <w:rPr>
-          <w:rFonts w:cstheme="minorHAnsi"/>
-          <w:color w:val="000000"/>
-          <w:sz w:val="26"/>
-          <w:szCs w:val="26"/>
-        </w:rPr>
-        <w:t>hiện</w:t>
-      </w:r>
-      <w:proofErr w:type="spellEnd"/>
-      <w:r>
-        <w:rPr>
-          <w:rFonts w:cstheme="minorHAnsi"/>
-          <w:color w:val="000000"/>
-          <w:sz w:val="26"/>
-          <w:szCs w:val="26"/>
-        </w:rPr>
-        <w:t xml:space="preserve"> </w:t>
-      </w:r>
-      <w:proofErr w:type="spellStart"/>
-      <w:r>
-        <w:rPr>
-          <w:rFonts w:cstheme="minorHAnsi"/>
-          <w:color w:val="000000"/>
-          <w:sz w:val="26"/>
-          <w:szCs w:val="26"/>
-        </w:rPr>
-        <w:t>tượng</w:t>
-      </w:r>
-      <w:proofErr w:type="spellEnd"/>
-      <w:r>
-        <w:rPr>
-          <w:rFonts w:cstheme="minorHAnsi"/>
-          <w:color w:val="000000"/>
-          <w:sz w:val="26"/>
-          <w:szCs w:val="26"/>
-        </w:rPr>
-        <w:t xml:space="preserve"> </w:t>
-      </w:r>
-      <w:proofErr w:type="spellStart"/>
-      <w:r>
-        <w:rPr>
-          <w:rFonts w:cstheme="minorHAnsi"/>
-          <w:color w:val="000000"/>
-          <w:sz w:val="26"/>
-          <w:szCs w:val="26"/>
-        </w:rPr>
-        <w:t>thắt</w:t>
-      </w:r>
-      <w:proofErr w:type="spellEnd"/>
-      <w:r>
-        <w:rPr>
-          <w:rFonts w:cstheme="minorHAnsi"/>
-          <w:color w:val="000000"/>
-          <w:sz w:val="26"/>
-          <w:szCs w:val="26"/>
-        </w:rPr>
-        <w:t xml:space="preserve"> </w:t>
-      </w:r>
-      <w:proofErr w:type="spellStart"/>
-      <w:r>
-        <w:rPr>
-          <w:rFonts w:cstheme="minorHAnsi"/>
-          <w:color w:val="000000"/>
-          <w:sz w:val="26"/>
-          <w:szCs w:val="26"/>
-        </w:rPr>
-        <w:t>nút</w:t>
-      </w:r>
-      <w:proofErr w:type="spellEnd"/>
-      <w:r>
-        <w:rPr>
-          <w:rFonts w:cstheme="minorHAnsi"/>
-          <w:color w:val="000000"/>
-          <w:sz w:val="26"/>
-          <w:szCs w:val="26"/>
-        </w:rPr>
-        <w:t xml:space="preserve"> </w:t>
-      </w:r>
-      <w:proofErr w:type="spellStart"/>
-      <w:r>
-        <w:rPr>
-          <w:rFonts w:cstheme="minorHAnsi"/>
-          <w:color w:val="000000"/>
-          <w:sz w:val="26"/>
-          <w:szCs w:val="26"/>
-        </w:rPr>
-        <w:t>cổ</w:t>
-      </w:r>
-      <w:proofErr w:type="spellEnd"/>
-      <w:r>
-        <w:rPr>
-          <w:rFonts w:cstheme="minorHAnsi"/>
-          <w:color w:val="000000"/>
-          <w:sz w:val="26"/>
-          <w:szCs w:val="26"/>
-        </w:rPr>
-        <w:t xml:space="preserve"> chai, </w:t>
-      </w:r>
-      <w:proofErr w:type="spellStart"/>
-      <w:r>
-        <w:rPr>
-          <w:rFonts w:cstheme="minorHAnsi"/>
-          <w:color w:val="000000"/>
-          <w:sz w:val="26"/>
-          <w:szCs w:val="26"/>
-        </w:rPr>
-        <w:t>các</w:t>
-      </w:r>
-      <w:proofErr w:type="spellEnd"/>
-      <w:r>
-        <w:rPr>
-          <w:rFonts w:cstheme="minorHAnsi"/>
-          <w:color w:val="000000"/>
-          <w:sz w:val="26"/>
-          <w:szCs w:val="26"/>
-        </w:rPr>
-        <w:t xml:space="preserve"> database </w:t>
-      </w:r>
-      <w:proofErr w:type="spellStart"/>
-      <w:r>
-        <w:rPr>
-          <w:rFonts w:cstheme="minorHAnsi"/>
-          <w:color w:val="000000"/>
-          <w:sz w:val="26"/>
-          <w:szCs w:val="26"/>
-        </w:rPr>
-        <w:t>hoạt</w:t>
-      </w:r>
-      <w:proofErr w:type="spellEnd"/>
-      <w:r>
-        <w:rPr>
-          <w:rFonts w:cstheme="minorHAnsi"/>
-          <w:color w:val="000000"/>
-          <w:sz w:val="26"/>
-          <w:szCs w:val="26"/>
-        </w:rPr>
-        <w:t xml:space="preserve"> </w:t>
-      </w:r>
-      <w:proofErr w:type="spellStart"/>
-      <w:r>
-        <w:rPr>
-          <w:rFonts w:cstheme="minorHAnsi"/>
-          <w:color w:val="000000"/>
-          <w:sz w:val="26"/>
-          <w:szCs w:val="26"/>
-        </w:rPr>
-        <w:t>động</w:t>
-      </w:r>
-      <w:proofErr w:type="spellEnd"/>
-      <w:r>
-        <w:rPr>
-          <w:rFonts w:cstheme="minorHAnsi"/>
-          <w:color w:val="000000"/>
-          <w:sz w:val="26"/>
-          <w:szCs w:val="26"/>
-        </w:rPr>
-        <w:t xml:space="preserve"> </w:t>
-      </w:r>
-      <w:proofErr w:type="spellStart"/>
-      <w:r>
-        <w:rPr>
-          <w:rFonts w:cstheme="minorHAnsi"/>
-          <w:color w:val="000000"/>
-          <w:sz w:val="26"/>
-          <w:szCs w:val="26"/>
-        </w:rPr>
-        <w:t>đọ</w:t>
-      </w:r>
-      <w:r>
-        <w:rPr>
-          <w:rFonts w:cstheme="minorHAnsi"/>
-          <w:color w:val="000000"/>
-          <w:sz w:val="26"/>
-          <w:szCs w:val="26"/>
-        </w:rPr>
-        <w:t>c</w:t>
-      </w:r>
-      <w:proofErr w:type="spellEnd"/>
-      <w:r>
-        <w:rPr>
-          <w:rFonts w:cstheme="minorHAnsi"/>
-          <w:color w:val="000000"/>
-          <w:sz w:val="26"/>
-          <w:szCs w:val="26"/>
-        </w:rPr>
-        <w:t>/</w:t>
-      </w:r>
-      <w:proofErr w:type="spellStart"/>
-      <w:r>
-        <w:rPr>
-          <w:rFonts w:cstheme="minorHAnsi"/>
-          <w:color w:val="000000"/>
-          <w:sz w:val="26"/>
-          <w:szCs w:val="26"/>
-        </w:rPr>
-        <w:t>ghi</w:t>
-      </w:r>
-      <w:proofErr w:type="spellEnd"/>
-      <w:r>
-        <w:rPr>
-          <w:rFonts w:cstheme="minorHAnsi"/>
-          <w:color w:val="000000"/>
-          <w:sz w:val="26"/>
-          <w:szCs w:val="26"/>
-        </w:rPr>
-        <w:t xml:space="preserve"> </w:t>
-      </w:r>
-      <w:proofErr w:type="spellStart"/>
-      <w:r>
-        <w:rPr>
-          <w:rFonts w:cstheme="minorHAnsi"/>
-          <w:color w:val="000000"/>
-          <w:sz w:val="26"/>
-          <w:szCs w:val="26"/>
-        </w:rPr>
-        <w:t>bình</w:t>
-      </w:r>
-      <w:proofErr w:type="spellEnd"/>
-      <w:r>
-        <w:rPr>
-          <w:rFonts w:cstheme="minorHAnsi"/>
-          <w:color w:val="000000"/>
-          <w:sz w:val="26"/>
-          <w:szCs w:val="26"/>
-        </w:rPr>
-        <w:t xml:space="preserve"> </w:t>
-      </w:r>
-      <w:proofErr w:type="spellStart"/>
-      <w:r>
-        <w:rPr>
-          <w:rFonts w:cstheme="minorHAnsi"/>
-          <w:color w:val="000000"/>
-          <w:sz w:val="26"/>
-          <w:szCs w:val="26"/>
-        </w:rPr>
-        <w:t>thường</w:t>
-      </w:r>
-      <w:proofErr w:type="spellEnd"/>
       <w:r>
         <w:rPr>
           <w:rFonts w:cstheme="minorHAnsi"/>
@@ -3537,7 +2981,6 @@
           <w:szCs w:val="26"/>
         </w:rPr>
       </w:pPr>
-      <w:proofErr w:type="spellStart"/>
       <w:r>
         <w:rPr>
           <w:rFonts w:cstheme="minorHAnsi"/>
@@ -3545,146 +2988,16 @@
           <w:sz w:val="26"/>
           <w:szCs w:val="26"/>
         </w:rPr>
-        <w:t>Tình</w:t>
+        <w:t xml:space="preserve">Tình trạng đồng bộ (AOG) từ DC về DR </w:t>
       </w:r>
-      <w:proofErr w:type="spellEnd"/>
       <w:r>
         <w:rPr>
-          <w:rFonts w:cstheme="minorHAnsi"/>
-          <w:color w:val="000000"/>
-          <w:sz w:val="26"/>
-          <w:szCs w:val="26"/>
-        </w:rPr>
-        <w:t xml:space="preserve"> </w:t>
+          <w:rFonts w:eastAsia="Times New Roman" w:cstheme="minorHAnsi"/>
+          <w:sz w:val="26"/>
+          <w:szCs w:val="26"/>
+        </w:rPr>
+        <w:t>bình thường</w:t>
       </w:r>
-      <w:proofErr w:type="spellStart"/>
-      <w:r>
-        <w:rPr>
-          <w:rFonts w:cstheme="minorHAnsi"/>
-          <w:color w:val="000000"/>
-          <w:sz w:val="26"/>
-          <w:szCs w:val="26"/>
-        </w:rPr>
-        <w:t>trạng</w:t>
-      </w:r>
-      <w:proofErr w:type="spellEnd"/>
-      <w:r>
-        <w:rPr>
-          <w:rFonts w:cstheme="minorHAnsi"/>
-          <w:color w:val="000000"/>
-          <w:sz w:val="26"/>
-          <w:szCs w:val="26"/>
-        </w:rPr>
-        <w:t xml:space="preserve"> </w:t>
-      </w:r>
-      <w:proofErr w:type="spellStart"/>
-      <w:r>
-        <w:rPr>
-          <w:rFonts w:cstheme="minorHAnsi"/>
-          <w:color w:val="000000"/>
-          <w:sz w:val="26"/>
-          <w:szCs w:val="26"/>
-        </w:rPr>
-        <w:t>đồng</w:t>
-      </w:r>
-      <w:proofErr w:type="spellEnd"/>
-      <w:r>
-        <w:rPr>
-          <w:rFonts w:cstheme="minorHAnsi"/>
-          <w:color w:val="000000"/>
-          <w:sz w:val="26"/>
-          <w:szCs w:val="26"/>
-        </w:rPr>
-        <w:t xml:space="preserve"> </w:t>
-      </w:r>
-      <w:proofErr w:type="spellStart"/>
-      <w:r>
-        <w:rPr>
-          <w:rFonts w:cstheme="minorHAnsi"/>
-          <w:color w:val="000000"/>
-          <w:sz w:val="26"/>
-          <w:szCs w:val="26"/>
-        </w:rPr>
-        <w:t>bộ</w:t>
-      </w:r>
-      <w:proofErr w:type="spellEnd"/>
-      <w:r>
-        <w:rPr>
-          <w:rFonts w:cstheme="minorHAnsi"/>
-          <w:color w:val="000000"/>
-          <w:sz w:val="26"/>
-          <w:szCs w:val="26"/>
-        </w:rPr>
-        <w:t xml:space="preserve"> (AOG) </w:t>
-      </w:r>
-      <w:proofErr w:type="spellStart"/>
-      <w:r>
-        <w:rPr>
-          <w:rFonts w:cstheme="minorHAnsi"/>
-          <w:color w:val="000000"/>
-          <w:sz w:val="26"/>
-          <w:szCs w:val="26"/>
-        </w:rPr>
-        <w:t>từ</w:t>
-      </w:r>
-      <w:proofErr w:type="spellEnd"/>
-      <w:r>
-        <w:rPr>
-          <w:rFonts w:cstheme="minorHAnsi"/>
-          <w:color w:val="000000"/>
-          <w:sz w:val="26"/>
-          <w:szCs w:val="26"/>
-        </w:rPr>
-        <w:t xml:space="preserve"> DC </w:t>
-      </w:r>
-      <w:proofErr w:type="spellStart"/>
-      <w:r>
-        <w:rPr>
-          <w:rFonts w:cstheme="minorHAnsi"/>
-          <w:color w:val="000000"/>
-          <w:sz w:val="26"/>
-          <w:szCs w:val="26"/>
-        </w:rPr>
-        <w:t>về</w:t>
-      </w:r>
-      <w:proofErr w:type="spellEnd"/>
-      <w:r>
-        <w:rPr>
-          <w:rFonts w:cstheme="minorHAnsi"/>
-          <w:color w:val="000000"/>
-          <w:sz w:val="26"/>
-          <w:szCs w:val="26"/>
-        </w:rPr>
-        <w:t xml:space="preserve"> DR </w:t>
-      </w:r>
-      <w:proofErr w:type="spellStart"/>
-      <w:r>
-        <w:rPr>
-          <w:rFonts w:eastAsia="Times New Roman" w:cstheme="minorHAnsi"/>
-          <w:sz w:val="26"/>
-          <w:szCs w:val="26"/>
-        </w:rPr>
-        <w:t>bình</w:t>
-      </w:r>
-      <w:proofErr w:type="spellEnd"/>
-      <w:r>
-        <w:rPr>
-          <w:rFonts w:eastAsia="Times New Roman" w:cstheme="minorHAnsi"/>
-          <w:sz w:val="26"/>
-          <w:szCs w:val="26"/>
-        </w:rPr>
-        <w:t xml:space="preserve"> </w:t>
-      </w:r>
-      <w:proofErr w:type="spellStart"/>
-      <w:r>
-        <w:rPr>
-          <w:rFonts w:eastAsia="Times New Roman" w:cstheme="minorHAnsi"/>
-          <w:sz w:val="26"/>
-          <w:szCs w:val="26"/>
-        </w:rPr>
-        <w:t>thường</w:t>
-      </w:r>
-      <w:proofErr w:type="spellEnd"/>
     </w:p>
     <w:p>
       <w:pPr>
@@ -3695,599 +3008,13 @@
           <w:szCs w:val="26"/>
         </w:rPr>
       </w:pPr>
-      <w:proofErr w:type="spellStart"/>
       <w:r>
         <w:rPr>
           <w:rFonts w:cstheme="minorHAnsi"/>
           <w:sz w:val="26"/>
           <w:szCs w:val="26"/>
         </w:rPr>
-        <w:t>Nhìn</w:t>
-      </w:r>
-      <w:proofErr w:type="spellEnd"/>
-      <w:r>
-        <w:rPr>
-          <w:rFonts w:cstheme="minorHAnsi"/>
-          <w:sz w:val="26"/>
-          <w:szCs w:val="26"/>
-        </w:rPr>
-        <w:t xml:space="preserve"> </w:t>
-      </w:r>
-      <w:proofErr w:type="spellStart"/>
-      <w:r>
-        <w:rPr>
-          <w:rFonts w:cstheme="minorHAnsi"/>
-          <w:sz w:val="26"/>
-          <w:szCs w:val="26"/>
-        </w:rPr>
-        <w:t>chung</w:t>
-      </w:r>
-      <w:proofErr w:type="spellEnd"/>
-      <w:r>
-        <w:rPr>
-          <w:rFonts w:cstheme="minorHAnsi"/>
-          <w:sz w:val="26"/>
-          <w:szCs w:val="26"/>
-        </w:rPr>
-        <w:t xml:space="preserve">, </w:t>
-      </w:r>
-      <w:proofErr w:type="spellStart"/>
-      <w:r>
-        <w:rPr>
-          <w:rFonts w:cstheme="minorHAnsi"/>
-          <w:sz w:val="26"/>
-          <w:szCs w:val="26"/>
-        </w:rPr>
-        <w:t>hệ</w:t>
-      </w:r>
-      <w:proofErr w:type="spellEnd"/>
-      <w:r>
-        <w:rPr>
-          <w:rFonts w:cstheme="minorHAnsi"/>
-          <w:sz w:val="26"/>
-          <w:szCs w:val="26"/>
-        </w:rPr>
-        <w:t xml:space="preserve"> </w:t>
-      </w:r>
-      <w:proofErr w:type="spellStart"/>
-      <w:r>
-        <w:rPr>
-          <w:rFonts w:cstheme="minorHAnsi"/>
-          <w:sz w:val="26"/>
-          <w:szCs w:val="26"/>
-        </w:rPr>
-        <w:t>thống</w:t>
-      </w:r>
-      <w:proofErr w:type="spellEnd"/>
-      <w:r>
-        <w:rPr>
-          <w:rFonts w:cstheme="minorHAnsi"/>
-          <w:sz w:val="26"/>
-          <w:szCs w:val="26"/>
-        </w:rPr>
-        <w:t xml:space="preserve"> </w:t>
-      </w:r>
-      <w:proofErr w:type="spellStart"/>
-      <w:r>
-        <w:rPr>
-          <w:rFonts w:cstheme="minorHAnsi"/>
-          <w:sz w:val="26"/>
-          <w:szCs w:val="26"/>
-        </w:rPr>
-        <w:t>cơ</w:t>
-      </w:r>
-      <w:proofErr w:type="spellEnd"/>
-      <w:r>
-        <w:rPr>
-          <w:rFonts w:cstheme="minorHAnsi"/>
-          <w:sz w:val="26"/>
-          <w:szCs w:val="26"/>
-        </w:rPr>
-        <w:t xml:space="preserve"> </w:t>
-      </w:r>
-      <w:proofErr w:type="spellStart"/>
-      <w:r>
-        <w:rPr>
-          <w:rFonts w:cstheme="minorHAnsi"/>
-          <w:sz w:val="26"/>
-          <w:szCs w:val="26"/>
-        </w:rPr>
-        <w:t>sở</w:t>
-      </w:r>
-      <w:proofErr w:type="spellEnd"/>
-      <w:r>
-        <w:rPr>
-          <w:rFonts w:cstheme="minorHAnsi"/>
-          <w:sz w:val="26"/>
-          <w:szCs w:val="26"/>
-        </w:rPr>
-        <w:t xml:space="preserve"> </w:t>
-      </w:r>
-      <w:proofErr w:type="spellStart"/>
-      <w:r>
-        <w:rPr>
-          <w:rFonts w:cstheme="minorHAnsi"/>
-          <w:sz w:val="26"/>
-          <w:szCs w:val="26"/>
-        </w:rPr>
-        <w:t>dữ</w:t>
-      </w:r>
-      <w:proofErr w:type="spellEnd"/>
-      <w:r>
-        <w:rPr>
-          <w:rFonts w:cstheme="minorHAnsi"/>
-          <w:sz w:val="26"/>
-          <w:szCs w:val="26"/>
-        </w:rPr>
-        <w:t xml:space="preserve"> </w:t>
-      </w:r>
-      <w:proofErr w:type="spellStart"/>
-      <w:r>
-        <w:rPr>
-          <w:rFonts w:cstheme="minorHAnsi"/>
-          <w:sz w:val="26"/>
-          <w:szCs w:val="26"/>
-        </w:rPr>
-        <w:t>liệu</w:t>
-      </w:r>
-      <w:proofErr w:type="spellEnd"/>
-      <w:r>
-        <w:rPr>
-          <w:rFonts w:cstheme="minorHAnsi"/>
-          <w:sz w:val="26"/>
-          <w:szCs w:val="26"/>
-        </w:rPr>
-        <w:t xml:space="preserve"> </w:t>
-      </w:r>
-      <w:proofErr w:type="spellStart"/>
-      <w:r>
-        <w:rPr>
-          <w:rFonts w:cstheme="minorHAnsi"/>
-          <w:sz w:val="26"/>
-          <w:szCs w:val="26"/>
-        </w:rPr>
-        <w:t>vẫn</w:t>
-      </w:r>
-      <w:proofErr w:type="spellEnd"/>
-      <w:r>
-        <w:rPr>
-          <w:rFonts w:cstheme="minorHAnsi"/>
-          <w:sz w:val="26"/>
-          <w:szCs w:val="26"/>
-        </w:rPr>
-        <w:t xml:space="preserve"> </w:t>
-      </w:r>
-      <w:proofErr w:type="spellStart"/>
-      <w:r>
-        <w:rPr>
-          <w:rFonts w:cstheme="minorHAnsi"/>
-          <w:sz w:val="26"/>
-          <w:szCs w:val="26"/>
-        </w:rPr>
-        <w:t>đang</w:t>
-      </w:r>
-      <w:proofErr w:type="spellEnd"/>
-      <w:r>
-        <w:rPr>
-          <w:rFonts w:cstheme="minorHAnsi"/>
-          <w:sz w:val="26"/>
-          <w:szCs w:val="26"/>
-        </w:rPr>
-        <w:t xml:space="preserve"> </w:t>
-      </w:r>
-      <w:proofErr w:type="spellStart"/>
-      <w:r>
-        <w:rPr>
-          <w:rFonts w:cstheme="minorHAnsi"/>
-          <w:sz w:val="26"/>
-          <w:szCs w:val="26"/>
-        </w:rPr>
-        <w:t>hoạt</w:t>
-      </w:r>
-      <w:proofErr w:type="spellEnd"/>
-      <w:r>
-        <w:rPr>
-          <w:rFonts w:cstheme="minorHAnsi"/>
-          <w:sz w:val="26"/>
-          <w:szCs w:val="26"/>
-        </w:rPr>
-        <w:t xml:space="preserve"> </w:t>
-      </w:r>
-      <w:proofErr w:type="spellStart"/>
-      <w:r>
-        <w:rPr>
-          <w:rFonts w:cstheme="minorHAnsi"/>
-          <w:sz w:val="26"/>
-          <w:szCs w:val="26"/>
-        </w:rPr>
-        <w:t>động</w:t>
-      </w:r>
-      <w:proofErr w:type="spellEnd"/>
-      <w:r>
-        <w:rPr>
-          <w:rFonts w:cstheme="minorHAnsi"/>
-          <w:sz w:val="26"/>
-          <w:szCs w:val="26"/>
-        </w:rPr>
-        <w:t xml:space="preserve"> </w:t>
-      </w:r>
-      <w:proofErr w:type="spellStart"/>
-      <w:r>
-        <w:rPr>
-          <w:rFonts w:cstheme="minorHAnsi"/>
-          <w:sz w:val="26"/>
-          <w:szCs w:val="26"/>
-        </w:rPr>
-        <w:t>ổn</w:t>
-      </w:r>
-      <w:proofErr w:type="spellEnd"/>
-      <w:r>
-        <w:rPr>
-          <w:rFonts w:cstheme="minorHAnsi"/>
-          <w:sz w:val="26"/>
-          <w:szCs w:val="26"/>
-        </w:rPr>
-        <w:t xml:space="preserve"> </w:t>
-      </w:r>
-      <w:proofErr w:type="spellStart"/>
-      <w:r>
-        <w:rPr>
-          <w:rFonts w:cstheme="minorHAnsi"/>
-          <w:sz w:val="26"/>
-          <w:szCs w:val="26"/>
-        </w:rPr>
-        <w:t>định</w:t>
-      </w:r>
-      <w:proofErr w:type="spellEnd"/>
-      <w:r>
-        <w:rPr>
-          <w:rFonts w:cstheme="minorHAnsi"/>
-          <w:sz w:val="26"/>
-          <w:szCs w:val="26"/>
-        </w:rPr>
-        <w:t xml:space="preserve">. Tuy </w:t>
-      </w:r>
-      <w:proofErr w:type="spellStart"/>
-      <w:r>
-        <w:rPr>
-          <w:rFonts w:cstheme="minorHAnsi"/>
-          <w:sz w:val="26"/>
-          <w:szCs w:val="26"/>
-        </w:rPr>
-        <w:t>nhiên</w:t>
-      </w:r>
-      <w:proofErr w:type="spellEnd"/>
-      <w:r>
-        <w:rPr>
-          <w:rFonts w:cstheme="minorHAnsi"/>
-          <w:sz w:val="26"/>
-          <w:szCs w:val="26"/>
-        </w:rPr>
-        <w:t xml:space="preserve">, </w:t>
-      </w:r>
-      <w:proofErr w:type="spellStart"/>
-      <w:r>
-        <w:rPr>
-          <w:rFonts w:cstheme="minorHAnsi"/>
-          <w:sz w:val="26"/>
-          <w:szCs w:val="26"/>
-        </w:rPr>
-        <w:t>để</w:t>
-      </w:r>
-      <w:proofErr w:type="spellEnd"/>
-      <w:r>
-        <w:rPr>
-          <w:rFonts w:cstheme="minorHAnsi"/>
-          <w:sz w:val="26"/>
-          <w:szCs w:val="26"/>
-        </w:rPr>
-        <w:t xml:space="preserve"> </w:t>
-      </w:r>
-      <w:proofErr w:type="spellStart"/>
-      <w:r>
-        <w:rPr>
-          <w:rFonts w:cstheme="minorHAnsi"/>
-          <w:sz w:val="26"/>
-          <w:szCs w:val="26"/>
-        </w:rPr>
-        <w:t>cải</w:t>
-      </w:r>
-      <w:proofErr w:type="spellEnd"/>
-      <w:r>
-        <w:rPr>
-          <w:rFonts w:cstheme="minorHAnsi"/>
-          <w:sz w:val="26"/>
-          <w:szCs w:val="26"/>
-        </w:rPr>
-        <w:t xml:space="preserve"> </w:t>
-      </w:r>
-      <w:proofErr w:type="spellStart"/>
-      <w:r>
-        <w:rPr>
-          <w:rFonts w:cstheme="minorHAnsi"/>
-          <w:sz w:val="26"/>
-          <w:szCs w:val="26"/>
-        </w:rPr>
-        <w:t>thiện</w:t>
-      </w:r>
-      <w:proofErr w:type="spellEnd"/>
-      <w:r>
-        <w:rPr>
-          <w:rFonts w:cstheme="minorHAnsi"/>
-          <w:sz w:val="26"/>
-          <w:szCs w:val="26"/>
-        </w:rPr>
-        <w:t xml:space="preserve"> </w:t>
-      </w:r>
-      <w:proofErr w:type="spellStart"/>
-      <w:r>
-        <w:rPr>
-          <w:rFonts w:cstheme="minorHAnsi"/>
-          <w:sz w:val="26"/>
-          <w:szCs w:val="26"/>
-        </w:rPr>
-        <w:t>thêm</w:t>
-      </w:r>
-      <w:proofErr w:type="spellEnd"/>
-      <w:r>
-        <w:rPr>
-          <w:rFonts w:cstheme="minorHAnsi"/>
-          <w:sz w:val="26"/>
-          <w:szCs w:val="26"/>
-        </w:rPr>
-        <w:t xml:space="preserve"> </w:t>
-      </w:r>
-      <w:proofErr w:type="spellStart"/>
-      <w:r>
-        <w:rPr>
-          <w:rFonts w:cstheme="minorHAnsi"/>
-          <w:sz w:val="26"/>
-          <w:szCs w:val="26"/>
-        </w:rPr>
-        <w:t>hiệu</w:t>
-      </w:r>
-      <w:proofErr w:type="spellEnd"/>
-      <w:r>
-        <w:rPr>
-          <w:rFonts w:cstheme="minorHAnsi"/>
-          <w:sz w:val="26"/>
-          <w:szCs w:val="26"/>
-        </w:rPr>
-        <w:t xml:space="preserve"> </w:t>
-      </w:r>
-      <w:proofErr w:type="spellStart"/>
-      <w:r>
-        <w:rPr>
-          <w:rFonts w:cstheme="minorHAnsi"/>
-          <w:sz w:val="26"/>
-          <w:szCs w:val="26"/>
-        </w:rPr>
-        <w:t>suất</w:t>
-      </w:r>
-      <w:proofErr w:type="spellEnd"/>
-      <w:r>
-        <w:rPr>
-          <w:rFonts w:cstheme="minorHAnsi"/>
-          <w:sz w:val="26"/>
-          <w:szCs w:val="26"/>
-        </w:rPr>
-        <w:t xml:space="preserve"> </w:t>
-      </w:r>
-      <w:proofErr w:type="spellStart"/>
-      <w:r>
-        <w:rPr>
-          <w:rFonts w:cstheme="minorHAnsi"/>
-          <w:sz w:val="26"/>
-          <w:szCs w:val="26"/>
-        </w:rPr>
-        <w:t>hệ</w:t>
-      </w:r>
-      <w:proofErr w:type="spellEnd"/>
-      <w:r>
-        <w:rPr>
-          <w:rFonts w:cstheme="minorHAnsi"/>
-          <w:sz w:val="26"/>
-          <w:szCs w:val="26"/>
-        </w:rPr>
-        <w:t xml:space="preserve"> </w:t>
-      </w:r>
-      <w:proofErr w:type="spellStart"/>
-      <w:r>
-        <w:rPr>
-          <w:rFonts w:cstheme="minorHAnsi"/>
-          <w:sz w:val="26"/>
-          <w:szCs w:val="26"/>
-        </w:rPr>
-        <w:t>thống</w:t>
-      </w:r>
-      <w:proofErr w:type="spellEnd"/>
-      <w:r>
-        <w:rPr>
-          <w:rFonts w:cstheme="minorHAnsi"/>
-          <w:sz w:val="26"/>
-          <w:szCs w:val="26"/>
-        </w:rPr>
-        <w:t xml:space="preserve">, </w:t>
-      </w:r>
-      <w:proofErr w:type="spellStart"/>
-      <w:r>
-        <w:rPr>
-          <w:rFonts w:cstheme="minorHAnsi"/>
-          <w:sz w:val="26"/>
-          <w:szCs w:val="26"/>
-        </w:rPr>
-        <w:t>báo</w:t>
-      </w:r>
-      <w:proofErr w:type="spellEnd"/>
-      <w:r>
-        <w:rPr>
-          <w:rFonts w:cstheme="minorHAnsi"/>
-          <w:sz w:val="26"/>
-          <w:szCs w:val="26"/>
-        </w:rPr>
-        <w:t xml:space="preserve"> </w:t>
-      </w:r>
-      <w:proofErr w:type="spellStart"/>
-      <w:r>
-        <w:rPr>
-          <w:rFonts w:cstheme="minorHAnsi"/>
-          <w:sz w:val="26"/>
-          <w:szCs w:val="26"/>
-        </w:rPr>
-        <w:t>cáo</w:t>
-      </w:r>
-      <w:proofErr w:type="spellEnd"/>
-      <w:r>
-        <w:rPr>
-          <w:rFonts w:cstheme="minorHAnsi"/>
-          <w:sz w:val="26"/>
-          <w:szCs w:val="26"/>
-        </w:rPr>
-        <w:t xml:space="preserve"> </w:t>
-      </w:r>
-      <w:proofErr w:type="spellStart"/>
-      <w:r>
-        <w:rPr>
-          <w:rFonts w:cstheme="minorHAnsi"/>
-          <w:sz w:val="26"/>
-          <w:szCs w:val="26"/>
-        </w:rPr>
-        <w:t>này</w:t>
-      </w:r>
-      <w:proofErr w:type="spellEnd"/>
-      <w:r>
-        <w:rPr>
-          <w:rFonts w:cstheme="minorHAnsi"/>
-          <w:sz w:val="26"/>
-          <w:szCs w:val="26"/>
-        </w:rPr>
-        <w:t xml:space="preserve"> </w:t>
-      </w:r>
-      <w:proofErr w:type="spellStart"/>
-      <w:r>
-        <w:rPr>
-          <w:rFonts w:cstheme="minorHAnsi"/>
-          <w:sz w:val="26"/>
-          <w:szCs w:val="26"/>
-        </w:rPr>
-        <w:t>có</w:t>
-      </w:r>
-      <w:proofErr w:type="spellEnd"/>
-      <w:r>
-        <w:rPr>
-          <w:rFonts w:cstheme="minorHAnsi"/>
-          <w:sz w:val="26"/>
-          <w:szCs w:val="26"/>
-        </w:rPr>
-        <w:t xml:space="preserve"> </w:t>
-      </w:r>
-      <w:proofErr w:type="spellStart"/>
-      <w:r>
-        <w:rPr>
-          <w:rFonts w:cstheme="minorHAnsi"/>
-          <w:sz w:val="26"/>
-          <w:szCs w:val="26"/>
-        </w:rPr>
-        <w:t>một</w:t>
-      </w:r>
-      <w:proofErr w:type="spellEnd"/>
-      <w:r>
-        <w:rPr>
-          <w:rFonts w:cstheme="minorHAnsi"/>
-          <w:sz w:val="26"/>
-          <w:szCs w:val="26"/>
-        </w:rPr>
-        <w:t xml:space="preserve"> </w:t>
-      </w:r>
-      <w:proofErr w:type="spellStart"/>
-      <w:r>
-        <w:rPr>
-          <w:rFonts w:cstheme="minorHAnsi"/>
-          <w:sz w:val="26"/>
-          <w:szCs w:val="26"/>
-        </w:rPr>
-        <w:t>số</w:t>
-      </w:r>
-      <w:proofErr w:type="spellEnd"/>
-      <w:r>
-        <w:rPr>
-          <w:rFonts w:cstheme="minorHAnsi"/>
-          <w:sz w:val="26"/>
-          <w:szCs w:val="26"/>
-        </w:rPr>
-        <w:t xml:space="preserve"> </w:t>
-      </w:r>
-      <w:proofErr w:type="spellStart"/>
-      <w:r>
-        <w:rPr>
-          <w:rFonts w:cstheme="minorHAnsi"/>
-          <w:sz w:val="26"/>
-          <w:szCs w:val="26"/>
-        </w:rPr>
-        <w:t>điểm</w:t>
-      </w:r>
-      <w:proofErr w:type="spellEnd"/>
-      <w:r>
-        <w:rPr>
-          <w:rFonts w:cstheme="minorHAnsi"/>
-          <w:sz w:val="26"/>
-          <w:szCs w:val="26"/>
-        </w:rPr>
-        <w:t xml:space="preserve"> </w:t>
-      </w:r>
-      <w:proofErr w:type="spellStart"/>
-      <w:r>
-        <w:rPr>
-          <w:rFonts w:cstheme="minorHAnsi"/>
-          <w:sz w:val="26"/>
-          <w:szCs w:val="26"/>
-        </w:rPr>
-        <w:t>lưu</w:t>
-      </w:r>
-      <w:proofErr w:type="spellEnd"/>
-      <w:r>
-        <w:rPr>
-          <w:rFonts w:cstheme="minorHAnsi"/>
-          <w:sz w:val="26"/>
-          <w:szCs w:val="26"/>
-        </w:rPr>
-        <w:t xml:space="preserve"> ý </w:t>
-      </w:r>
-      <w:proofErr w:type="spellStart"/>
-      <w:r>
-        <w:rPr>
-          <w:rFonts w:cstheme="minorHAnsi"/>
-          <w:sz w:val="26"/>
-          <w:szCs w:val="26"/>
-        </w:rPr>
-        <w:t>như</w:t>
-      </w:r>
-      <w:proofErr w:type="spellEnd"/>
-      <w:r>
-        <w:rPr>
-          <w:rFonts w:cstheme="minorHAnsi"/>
-          <w:sz w:val="26"/>
-          <w:szCs w:val="26"/>
-        </w:rPr>
-        <w:t xml:space="preserve"> </w:t>
-      </w:r>
-      <w:proofErr w:type="spellStart"/>
-      <w:r>
-        <w:rPr>
-          <w:rFonts w:cstheme="minorHAnsi"/>
-          <w:sz w:val="26"/>
-          <w:szCs w:val="26"/>
-        </w:rPr>
-        <w:t>sau</w:t>
-      </w:r>
-      <w:proofErr w:type="spellEnd"/>
-      <w:r>
-        <w:rPr>
-          <w:rFonts w:cstheme="minorHAnsi"/>
-          <w:sz w:val="26"/>
-          <w:szCs w:val="26"/>
-        </w:rPr>
-        <w:t>:</w:t>
+        <w:t>Nhìn chung, hệ thống cơ sở dữ liệu vẫn đang hoạt động ổn định. Tuy nhiên, để cải thiện thêm hiệu suất hệ thống, báo cáo này có một số điểm lưu ý như sau:</w:t>
       </w:r>
     </w:p>
     <w:tbl>
@@ -4458,21 +3185,7 @@
               <w:rPr>
                 <w:rFonts w:cstheme="minorHAnsi"/>
               </w:rPr>
-              <w:t xml:space="preserve">3.1 Dung </w:t>
-            </w:r>
-            <w:proofErr w:type="spellStart"/>
-            <w:r>
-              <w:rPr>
-                <w:rFonts w:cstheme="minorHAnsi"/>
-              </w:rPr>
-              <w:t>lượng</w:t>
-            </w:r>
-            <w:proofErr w:type="spellEnd"/>
-            <w:r>
-              <w:rPr>
-                <w:rFonts w:cstheme="minorHAnsi"/>
-              </w:rPr>
-              <w:t xml:space="preserve"> hard disk</w:t>
+              <w:t>3.1 Dung lượng hard disk</w:t>
             </w:r>
           </w:p>
         </w:tc>
@@ -4611,69 +3324,8 @@
               </w:rPr>
             </w:pPr>
             <w:r>
-              <w:t xml:space="preserve">51. Các </w:t>
-            </w:r>
-            <w:proofErr w:type="spellStart"/>
-            <w:r>
-              <w:t>câu</w:t>
-            </w:r>
-            <w:proofErr w:type="spellEnd"/>
-            <w:r>
-              <w:t xml:space="preserve"> </w:t>
-            </w:r>
-            <w:proofErr w:type="spellStart"/>
-            <w:r>
-              <w:t>lệnh</w:t>
-            </w:r>
-            <w:proofErr w:type="spellEnd"/>
-            <w:r>
-              <w:t xml:space="preserve"> </w:t>
-            </w:r>
-            <w:proofErr w:type="spellStart"/>
-            <w:r>
-              <w:t>khi</w:t>
-            </w:r>
-            <w:proofErr w:type="spellEnd"/>
-            <w:r>
-              <w:t xml:space="preserve"> </w:t>
-            </w:r>
-            <w:proofErr w:type="spellStart"/>
-            <w:r>
-              <w:t>chạy</w:t>
-            </w:r>
-            <w:proofErr w:type="spellEnd"/>
-            <w:r>
-              <w:t xml:space="preserve"> </w:t>
-            </w:r>
-            <w:proofErr w:type="spellStart"/>
-            <w:r>
-              <w:t>chiếm</w:t>
-            </w:r>
-            <w:proofErr w:type="spellEnd"/>
-            <w:r>
-              <w:t xml:space="preserve"> </w:t>
-            </w:r>
-            <w:proofErr w:type="spellStart"/>
-            <w:r>
-              <w:t>nhiều</w:t>
-            </w:r>
-            <w:proofErr w:type="spellEnd"/>
-            <w:r>
-              <w:t xml:space="preserve"> </w:t>
-            </w:r>
-            <w:proofErr w:type="spellStart"/>
-            <w:r>
-              <w:t>tài</w:t>
-            </w:r>
-            <w:proofErr w:type="spellEnd"/>
-            <w:r>
-              <w:t xml:space="preserve"> </w:t>
-            </w:r>
-            <w:proofErr w:type="spellStart"/>
-            <w:r>
-              <w:t>nguyên</w:t>
-            </w:r>
-            <w:proofErr w:type="spellEnd"/>
+              <w:t>51. Các câu lệnh khi chạy chiếm nhiều tài nguyên</w:t>
+            </w:r>
           </w:p>
         </w:tc>
         <w:tc>
@@ -4896,58 +3548,8 @@
               <w:rPr>
                 <w:rFonts w:cstheme="minorHAnsi"/>
               </w:rPr>
-              <w:t xml:space="preserve">6 Sao </w:t>
-            </w:r>
-            <w:proofErr w:type="spellStart"/>
-            <w:r>
-              <w:rPr>
-                <w:rFonts w:cstheme="minorHAnsi"/>
-              </w:rPr>
-              <w:t>lưu</w:t>
-            </w:r>
-            <w:proofErr w:type="spellEnd"/>
-            <w:r>
-              <w:rPr>
-                <w:rFonts w:cstheme="minorHAnsi"/>
-              </w:rPr>
-              <w:t xml:space="preserve"> </w:t>
-            </w:r>
-            <w:proofErr w:type="spellStart"/>
-            <w:r>
-              <w:rPr>
-                <w:rFonts w:cstheme="minorHAnsi"/>
-              </w:rPr>
-              <w:t>và</w:t>
-            </w:r>
-            <w:proofErr w:type="spellEnd"/>
-            <w:r>
-              <w:rPr>
-                <w:rFonts w:cstheme="minorHAnsi"/>
-              </w:rPr>
-              <w:t xml:space="preserve"> </w:t>
-            </w:r>
-            <w:proofErr w:type="spellStart"/>
-            <w:r>
-              <w:rPr>
-                <w:rFonts w:cstheme="minorHAnsi"/>
-              </w:rPr>
-              <w:t>phục</w:t>
-            </w:r>
-            <w:proofErr w:type="spellEnd"/>
-            <w:r>
-              <w:rPr>
-                <w:rFonts w:cstheme="minorHAnsi"/>
-              </w:rPr>
-              <w:t xml:space="preserve"> </w:t>
-            </w:r>
-            <w:proofErr w:type="spellStart"/>
-            <w:r>
-              <w:rPr>
-                <w:rFonts w:cstheme="minorHAnsi"/>
-              </w:rPr>
-              <w:t>hồi</w:t>
-            </w:r>
-            <w:proofErr w:type="spellEnd"/>
+              <w:t>6 Sao lưu và phục hồi</w:t>
+            </w:r>
           </w:p>
         </w:tc>
         <w:tc>
@@ -4969,27 +3571,13 @@
               <w:rPr>
                 <w:rFonts w:cstheme="minorHAnsi"/>
               </w:rPr>
-              <w:t>{{summary_backup_assessment</w:t>
-            </w:r>
-            <w:proofErr w:type="gramStart"/>
-            <w:r>
-              <w:rPr>
-                <w:rFonts w:cstheme="minorHAnsi"/>
-              </w:rPr>
-              <w:t>}}</w:t>
-            </w:r>
-            <w:r>
-              <w:rPr>
-                <w:rFonts w:cstheme="minorHAnsi"/>
-              </w:rPr>
-              <w:t xml:space="preserve">   </w:t>
-            </w:r>
-            <w:proofErr w:type="gramEnd"/>
-            <w:r>
-              <w:rPr>
-                <w:rFonts w:cstheme="minorHAnsi"/>
-              </w:rPr>
-              <w:t xml:space="preserve">                           </w:t>
+              <w:t>{{summary_backup_assessment}}</w:t>
+            </w:r>
+            <w:r>
+              <w:rPr>
+                <w:rFonts w:cstheme="minorHAnsi"/>
+              </w:rPr>
+              <w:t xml:space="preserve">                              </w:t>
             </w:r>
           </w:p>
         </w:tc>
@@ -5071,203 +3659,13 @@
           <w:szCs w:val="26"/>
         </w:rPr>
       </w:pPr>
-      <w:proofErr w:type="spellStart"/>
       <w:r>
         <w:rPr>
           <w:rFonts w:cstheme="minorHAnsi"/>
           <w:sz w:val="26"/>
           <w:szCs w:val="26"/>
         </w:rPr>
-        <w:t>Để</w:t>
-      </w:r>
-      <w:proofErr w:type="spellEnd"/>
-      <w:r>
-        <w:rPr>
-          <w:rFonts w:cstheme="minorHAnsi"/>
-          <w:sz w:val="26"/>
-          <w:szCs w:val="26"/>
-        </w:rPr>
-        <w:t xml:space="preserve"> </w:t>
-      </w:r>
-      <w:proofErr w:type="spellStart"/>
-      <w:r>
-        <w:rPr>
-          <w:rFonts w:cstheme="minorHAnsi"/>
-          <w:sz w:val="26"/>
-          <w:szCs w:val="26"/>
-        </w:rPr>
-        <w:t>nắm</w:t>
-      </w:r>
-      <w:proofErr w:type="spellEnd"/>
-      <w:r>
-        <w:rPr>
-          <w:rFonts w:cstheme="minorHAnsi"/>
-          <w:sz w:val="26"/>
-          <w:szCs w:val="26"/>
-        </w:rPr>
-        <w:t xml:space="preserve"> </w:t>
-      </w:r>
-      <w:proofErr w:type="spellStart"/>
-      <w:r>
-        <w:rPr>
-          <w:rFonts w:cstheme="minorHAnsi"/>
-          <w:sz w:val="26"/>
-          <w:szCs w:val="26"/>
-        </w:rPr>
-        <w:t>rõ</w:t>
-      </w:r>
-      <w:proofErr w:type="spellEnd"/>
-      <w:r>
-        <w:rPr>
-          <w:rFonts w:cstheme="minorHAnsi"/>
-          <w:sz w:val="26"/>
-          <w:szCs w:val="26"/>
-        </w:rPr>
-        <w:t xml:space="preserve"> chi </w:t>
-      </w:r>
-      <w:proofErr w:type="spellStart"/>
-      <w:r>
-        <w:rPr>
-          <w:rFonts w:cstheme="minorHAnsi"/>
-          <w:sz w:val="26"/>
-          <w:szCs w:val="26"/>
-        </w:rPr>
-        <w:t>tiết</w:t>
-      </w:r>
-      <w:proofErr w:type="spellEnd"/>
-      <w:r>
-        <w:rPr>
-          <w:rFonts w:cstheme="minorHAnsi"/>
-          <w:sz w:val="26"/>
-          <w:szCs w:val="26"/>
-        </w:rPr>
-        <w:t xml:space="preserve">, </w:t>
-      </w:r>
-      <w:proofErr w:type="spellStart"/>
-      <w:r>
-        <w:rPr>
-          <w:rFonts w:cstheme="minorHAnsi"/>
-          <w:sz w:val="26"/>
-          <w:szCs w:val="26"/>
-        </w:rPr>
-        <w:t>vui</w:t>
-      </w:r>
-      <w:proofErr w:type="spellEnd"/>
-      <w:r>
-        <w:rPr>
-          <w:rFonts w:cstheme="minorHAnsi"/>
-          <w:sz w:val="26"/>
-          <w:szCs w:val="26"/>
-        </w:rPr>
-        <w:t xml:space="preserve"> </w:t>
-      </w:r>
-      <w:proofErr w:type="spellStart"/>
-      <w:r>
-        <w:rPr>
-          <w:rFonts w:cstheme="minorHAnsi"/>
-          <w:sz w:val="26"/>
-          <w:szCs w:val="26"/>
-        </w:rPr>
-        <w:t>lòng</w:t>
-      </w:r>
-      <w:proofErr w:type="spellEnd"/>
-      <w:r>
-        <w:rPr>
-          <w:rFonts w:cstheme="minorHAnsi"/>
-          <w:sz w:val="26"/>
-          <w:szCs w:val="26"/>
-        </w:rPr>
-        <w:t xml:space="preserve"> </w:t>
-      </w:r>
-      <w:proofErr w:type="spellStart"/>
-      <w:r>
-        <w:rPr>
-          <w:rFonts w:cstheme="minorHAnsi"/>
-          <w:sz w:val="26"/>
-          <w:szCs w:val="26"/>
-        </w:rPr>
-        <w:t>đọc</w:t>
-      </w:r>
-      <w:proofErr w:type="spellEnd"/>
-      <w:r>
-        <w:rPr>
-          <w:rFonts w:cstheme="minorHAnsi"/>
-          <w:sz w:val="26"/>
-          <w:szCs w:val="26"/>
-        </w:rPr>
-        <w:t xml:space="preserve"> </w:t>
-      </w:r>
-      <w:proofErr w:type="spellStart"/>
-      <w:r>
-        <w:rPr>
-          <w:rFonts w:cstheme="minorHAnsi"/>
-          <w:sz w:val="26"/>
-          <w:szCs w:val="26"/>
-        </w:rPr>
-        <w:t>toàn</w:t>
-      </w:r>
-      <w:proofErr w:type="spellEnd"/>
-      <w:r>
-        <w:rPr>
-          <w:rFonts w:cstheme="minorHAnsi"/>
-          <w:sz w:val="26"/>
-          <w:szCs w:val="26"/>
-        </w:rPr>
-        <w:t xml:space="preserve"> </w:t>
-      </w:r>
-      <w:proofErr w:type="spellStart"/>
-      <w:r>
-        <w:rPr>
-          <w:rFonts w:cstheme="minorHAnsi"/>
-          <w:sz w:val="26"/>
-          <w:szCs w:val="26"/>
-        </w:rPr>
-        <w:t>bộ</w:t>
-      </w:r>
-      <w:proofErr w:type="spellEnd"/>
-      <w:r>
-        <w:rPr>
-          <w:rFonts w:cstheme="minorHAnsi"/>
-          <w:sz w:val="26"/>
-          <w:szCs w:val="26"/>
-        </w:rPr>
-        <w:t xml:space="preserve"> </w:t>
-      </w:r>
-      <w:proofErr w:type="spellStart"/>
-      <w:r>
-        <w:rPr>
-          <w:rFonts w:cstheme="minorHAnsi"/>
-          <w:sz w:val="26"/>
-          <w:szCs w:val="26"/>
-        </w:rPr>
-        <w:t>báo</w:t>
-      </w:r>
-      <w:proofErr w:type="spellEnd"/>
-      <w:r>
-        <w:rPr>
-          <w:rFonts w:cstheme="minorHAnsi"/>
-          <w:sz w:val="26"/>
-          <w:szCs w:val="26"/>
-        </w:rPr>
-        <w:t xml:space="preserve"> </w:t>
-      </w:r>
-      <w:proofErr w:type="spellStart"/>
-      <w:r>
-        <w:rPr>
-          <w:rFonts w:cstheme="minorHAnsi"/>
-          <w:sz w:val="26"/>
-          <w:szCs w:val="26"/>
-        </w:rPr>
-        <w:t>cáo</w:t>
-      </w:r>
-      <w:proofErr w:type="spellEnd"/>
-      <w:r>
-        <w:rPr>
-          <w:rFonts w:cstheme="minorHAnsi"/>
-          <w:sz w:val="26"/>
-          <w:szCs w:val="26"/>
-        </w:rPr>
-        <w:t>.</w:t>
+        <w:t>Để nắm rõ chi tiết, vui lòng đọc toàn bộ báo cáo.</w:t>
       </w:r>
       <w:r>
         <w:rPr>
@@ -5346,9 +3744,6 @@
       </w:pPr>
       <w:bookmarkStart w:id="8" w:name="_Toc30406751"/>
       <w:bookmarkStart w:id="9" w:name="_Toc176768588"/>
-      <w:r>
-        <w:t>z</w:t>
-      </w:r>
       <w:r>
         <w:t>HỆ THỐNG ĐĨA</w:t>
       </w:r>
@@ -5394,7 +3789,6 @@
                 <w:bCs/>
               </w:rPr>
             </w:pPr>
-            <w:proofErr w:type="spellStart"/>
             <w:r>
               <w:rPr>
                 <w:rFonts w:cstheme="minorHAnsi"/>
@@ -5403,7 +3797,6 @@
               </w:rPr>
               <w:t>volume_mount_point</w:t>
             </w:r>
-            <w:proofErr w:type="spellEnd"/>
           </w:p>
         </w:tc>
         <w:tc>
@@ -5429,21 +3822,7 @@
               <w:rPr>
                 <w:rFonts w:cstheme="minorHAnsi"/>
               </w:rPr>
-              <w:t>{{</w:t>
-            </w:r>
-            <w:proofErr w:type="spellStart"/>
-            <w:r>
-              <w:rPr>
-                <w:rFonts w:cstheme="minorHAnsi"/>
-              </w:rPr>
-              <w:t>disk_volume_mount_point</w:t>
-            </w:r>
-            <w:proofErr w:type="spellEnd"/>
-            <w:r>
-              <w:rPr>
-                <w:rFonts w:cstheme="minorHAnsi"/>
-              </w:rPr>
-              <w:t>}}</w:t>
+              <w:t>{{disk_volume_mount_point}}</w:t>
             </w:r>
           </w:p>
         </w:tc>
@@ -5470,7 +3849,6 @@
                 <w:bCs/>
               </w:rPr>
             </w:pPr>
-            <w:proofErr w:type="spellStart"/>
             <w:r>
               <w:rPr>
                 <w:rFonts w:cstheme="minorHAnsi"/>
@@ -5479,7 +3857,6 @@
               </w:rPr>
               <w:t>file_system_type</w:t>
             </w:r>
-            <w:proofErr w:type="spellEnd"/>
           </w:p>
         </w:tc>
         <w:tc>
@@ -5505,21 +3882,7 @@
               <w:rPr>
                 <w:rFonts w:cstheme="minorHAnsi"/>
               </w:rPr>
-              <w:t>{{</w:t>
-            </w:r>
-            <w:proofErr w:type="spellStart"/>
-            <w:r>
-              <w:rPr>
-                <w:rFonts w:cstheme="minorHAnsi"/>
-              </w:rPr>
-              <w:t>disk_file_system_type</w:t>
-            </w:r>
-            <w:proofErr w:type="spellEnd"/>
-            <w:r>
-              <w:rPr>
-                <w:rFonts w:cstheme="minorHAnsi"/>
-              </w:rPr>
-              <w:t>}}</w:t>
+              <w:t>{{disk_file_system_type}}</w:t>
             </w:r>
           </w:p>
         </w:tc>
@@ -5545,7 +3908,6 @@
                 <w:bCs/>
               </w:rPr>
             </w:pPr>
-            <w:proofErr w:type="spellStart"/>
             <w:r>
               <w:rPr>
                 <w:rFonts w:cstheme="minorHAnsi"/>
@@ -5554,7 +3916,6 @@
               </w:rPr>
               <w:t>logical_volume_name</w:t>
             </w:r>
-            <w:proofErr w:type="spellEnd"/>
           </w:p>
         </w:tc>
         <w:tc>
@@ -5579,21 +3940,7 @@
               <w:rPr>
                 <w:rFonts w:cstheme="minorHAnsi"/>
               </w:rPr>
-              <w:t>{{</w:t>
-            </w:r>
-            <w:proofErr w:type="spellStart"/>
-            <w:r>
-              <w:rPr>
-                <w:rFonts w:cstheme="minorHAnsi"/>
-              </w:rPr>
-              <w:t>disk_logical_volume_name</w:t>
-            </w:r>
-            <w:proofErr w:type="spellEnd"/>
-            <w:r>
-              <w:rPr>
-                <w:rFonts w:cstheme="minorHAnsi"/>
-              </w:rPr>
-              <w:t>}}</w:t>
+              <w:t>{{disk_logical_volume_name}}</w:t>
             </w:r>
           </w:p>
         </w:tc>
@@ -5654,21 +4001,7 @@
               <w:rPr>
                 <w:rFonts w:cstheme="minorHAnsi"/>
               </w:rPr>
-              <w:t>{{</w:t>
-            </w:r>
-            <w:proofErr w:type="spellStart"/>
-            <w:r>
-              <w:rPr>
-                <w:rFonts w:cstheme="minorHAnsi"/>
-              </w:rPr>
-              <w:t>disk_total_size_gb</w:t>
-            </w:r>
-            <w:proofErr w:type="spellEnd"/>
-            <w:r>
-              <w:rPr>
-                <w:rFonts w:cstheme="minorHAnsi"/>
-              </w:rPr>
-              <w:t>}}</w:t>
+              <w:t>{{disk_total_size_gb}}</w:t>
             </w:r>
           </w:p>
         </w:tc>
@@ -5728,21 +4061,7 @@
               <w:rPr>
                 <w:rFonts w:cstheme="minorHAnsi"/>
               </w:rPr>
-              <w:t>{{</w:t>
-            </w:r>
-            <w:proofErr w:type="spellStart"/>
-            <w:r>
-              <w:rPr>
-                <w:rFonts w:cstheme="minorHAnsi"/>
-              </w:rPr>
-              <w:t>processor_cores</w:t>
-            </w:r>
-            <w:proofErr w:type="spellEnd"/>
-            <w:r>
-              <w:rPr>
-                <w:rFonts w:cstheme="minorHAnsi"/>
-              </w:rPr>
-              <w:t>}}</w:t>
+              <w:t>{{processor_cores}}</w:t>
             </w:r>
           </w:p>
         </w:tc>
@@ -5801,21 +4120,7 @@
               <w:rPr>
                 <w:rFonts w:cstheme="minorHAnsi"/>
               </w:rPr>
-              <w:t>{{</w:t>
-            </w:r>
-            <w:proofErr w:type="spellStart"/>
-            <w:r>
-              <w:rPr>
-                <w:rFonts w:cstheme="minorHAnsi"/>
-              </w:rPr>
-              <w:t>disk_space_free_pct</w:t>
-            </w:r>
-            <w:proofErr w:type="spellEnd"/>
-            <w:r>
-              <w:rPr>
-                <w:rFonts w:cstheme="minorHAnsi"/>
-              </w:rPr>
-              <w:t>}}</w:t>
+              <w:t>{{disk_space_free_pct}}</w:t>
             </w:r>
           </w:p>
         </w:tc>
@@ -5907,21 +4212,7 @@
               <w:rPr>
                 <w:rFonts w:cstheme="minorHAnsi"/>
               </w:rPr>
-              <w:t>{{</w:t>
-            </w:r>
-            <w:proofErr w:type="spellStart"/>
-            <w:r>
-              <w:rPr>
-                <w:rFonts w:cstheme="minorHAnsi"/>
-              </w:rPr>
-              <w:t>machine_name</w:t>
-            </w:r>
-            <w:proofErr w:type="spellEnd"/>
-            <w:r>
-              <w:rPr>
-                <w:rFonts w:cstheme="minorHAnsi"/>
-              </w:rPr>
-              <w:t>}}</w:t>
+              <w:t>{{machine_name}}</w:t>
             </w:r>
           </w:p>
         </w:tc>
@@ -5979,21 +4270,7 @@
               <w:rPr>
                 <w:rFonts w:cstheme="minorHAnsi"/>
               </w:rPr>
-              <w:t>{{</w:t>
-            </w:r>
-            <w:proofErr w:type="spellStart"/>
-            <w:r>
-              <w:rPr>
-                <w:rFonts w:cstheme="minorHAnsi"/>
-              </w:rPr>
-              <w:t>operating_system</w:t>
-            </w:r>
-            <w:proofErr w:type="spellEnd"/>
-            <w:r>
-              <w:rPr>
-                <w:rFonts w:cstheme="minorHAnsi"/>
-              </w:rPr>
-              <w:t>}}</w:t>
+              <w:t>{{operating_system}}</w:t>
             </w:r>
           </w:p>
         </w:tc>
@@ -6111,23 +4388,7 @@
                 <w:rFonts w:cstheme="minorHAnsi"/>
                 <w:lang w:val="fr-FR"/>
               </w:rPr>
-              <w:t>{{</w:t>
-            </w:r>
-            <w:proofErr w:type="spellStart"/>
-            <w:r>
-              <w:rPr>
-                <w:rFonts w:cstheme="minorHAnsi"/>
-                <w:lang w:val="fr-FR"/>
-              </w:rPr>
-              <w:t>physical_processors</w:t>
-            </w:r>
-            <w:proofErr w:type="spellEnd"/>
-            <w:r>
-              <w:rPr>
-                <w:rFonts w:cstheme="minorHAnsi"/>
-                <w:lang w:val="fr-FR"/>
-              </w:rPr>
-              <w:t>}}</w:t>
+              <w:t>{{physical_processors}}</w:t>
             </w:r>
           </w:p>
         </w:tc>
@@ -6185,21 +4446,7 @@
               <w:rPr>
                 <w:rFonts w:cstheme="minorHAnsi"/>
               </w:rPr>
-              <w:t>{{</w:t>
-            </w:r>
-            <w:proofErr w:type="spellStart"/>
-            <w:r>
-              <w:rPr>
-                <w:rFonts w:cstheme="minorHAnsi"/>
-              </w:rPr>
-              <w:t>processor_cores</w:t>
-            </w:r>
-            <w:proofErr w:type="spellEnd"/>
-            <w:r>
-              <w:rPr>
-                <w:rFonts w:cstheme="minorHAnsi"/>
-              </w:rPr>
-              <w:t>}}</w:t>
+              <w:t>{{processor_cores}}</w:t>
             </w:r>
           </w:p>
         </w:tc>
@@ -6257,21 +4504,7 @@
               <w:rPr>
                 <w:rFonts w:cstheme="minorHAnsi"/>
               </w:rPr>
-              <w:t>{{</w:t>
-            </w:r>
-            <w:proofErr w:type="spellStart"/>
-            <w:r>
-              <w:rPr>
-                <w:rFonts w:cstheme="minorHAnsi"/>
-              </w:rPr>
-              <w:t>logical_processors</w:t>
-            </w:r>
-            <w:proofErr w:type="spellEnd"/>
-            <w:r>
-              <w:rPr>
-                <w:rFonts w:cstheme="minorHAnsi"/>
-              </w:rPr>
-              <w:t>}}</w:t>
+              <w:t>{{logical_processors}}</w:t>
             </w:r>
           </w:p>
         </w:tc>
@@ -6329,21 +4562,7 @@
               <w:rPr>
                 <w:rFonts w:cstheme="minorHAnsi"/>
               </w:rPr>
-              <w:t>{{</w:t>
-            </w:r>
-            <w:proofErr w:type="spellStart"/>
-            <w:r>
-              <w:rPr>
-                <w:rFonts w:cstheme="minorHAnsi"/>
-              </w:rPr>
-              <w:t>physical_memory_mb</w:t>
-            </w:r>
-            <w:proofErr w:type="spellEnd"/>
-            <w:r>
-              <w:rPr>
-                <w:rFonts w:cstheme="minorHAnsi"/>
-              </w:rPr>
-              <w:t>}}</w:t>
+              <w:t>{{physical_memory_mb}}</w:t>
             </w:r>
           </w:p>
         </w:tc>
@@ -6481,21 +4700,7 @@
               <w:rPr>
                 <w:rFonts w:eastAsia="Times New Roman" w:cstheme="minorHAnsi"/>
               </w:rPr>
-              <w:t>{{</w:t>
-            </w:r>
-            <w:proofErr w:type="spellStart"/>
-            <w:r>
-              <w:rPr>
-                <w:rFonts w:eastAsia="Times New Roman" w:cstheme="minorHAnsi"/>
-              </w:rPr>
-              <w:t>instance_name</w:t>
-            </w:r>
-            <w:proofErr w:type="spellEnd"/>
-            <w:r>
-              <w:rPr>
-                <w:rFonts w:eastAsia="Times New Roman" w:cstheme="minorHAnsi"/>
-              </w:rPr>
-              <w:t>}}</w:t>
+              <w:t>{{instance_name}}</w:t>
             </w:r>
           </w:p>
         </w:tc>
@@ -6620,21 +4825,7 @@
               <w:rPr>
                 <w:rFonts w:eastAsia="Times New Roman" w:cstheme="minorHAnsi"/>
               </w:rPr>
-              <w:t>{{</w:t>
-            </w:r>
-            <w:proofErr w:type="spellStart"/>
-            <w:r>
-              <w:rPr>
-                <w:rFonts w:eastAsia="Times New Roman" w:cstheme="minorHAnsi"/>
-              </w:rPr>
-              <w:t>sql_server_version</w:t>
-            </w:r>
-            <w:proofErr w:type="spellEnd"/>
-            <w:r>
-              <w:rPr>
-                <w:rFonts w:eastAsia="Times New Roman" w:cstheme="minorHAnsi"/>
-              </w:rPr>
-              <w:t>}}</w:t>
+              <w:t>{{sql_server_version}}</w:t>
             </w:r>
           </w:p>
         </w:tc>
@@ -6752,21 +4943,7 @@
               <w:rPr>
                 <w:rFonts w:eastAsia="Times New Roman" w:cstheme="minorHAnsi"/>
               </w:rPr>
-              <w:t>{{</w:t>
-            </w:r>
-            <w:proofErr w:type="spellStart"/>
-            <w:r>
-              <w:rPr>
-                <w:rFonts w:eastAsia="Times New Roman" w:cstheme="minorHAnsi"/>
-              </w:rPr>
-              <w:t>data_path</w:t>
-            </w:r>
-            <w:proofErr w:type="spellEnd"/>
-            <w:r>
-              <w:rPr>
-                <w:rFonts w:eastAsia="Times New Roman" w:cstheme="minorHAnsi"/>
-              </w:rPr>
-              <w:t>}}</w:t>
+              <w:t>{{data_path}}</w:t>
             </w:r>
           </w:p>
         </w:tc>
@@ -6825,21 +5002,7 @@
               <w:rPr>
                 <w:rFonts w:eastAsia="Times New Roman" w:cstheme="minorHAnsi"/>
               </w:rPr>
-              <w:t>{{</w:t>
-            </w:r>
-            <w:proofErr w:type="spellStart"/>
-            <w:r>
-              <w:rPr>
-                <w:rFonts w:eastAsia="Times New Roman" w:cstheme="minorHAnsi"/>
-              </w:rPr>
-              <w:t>log_path</w:t>
-            </w:r>
-            <w:proofErr w:type="spellEnd"/>
-            <w:r>
-              <w:rPr>
-                <w:rFonts w:eastAsia="Times New Roman" w:cstheme="minorHAnsi"/>
-              </w:rPr>
-              <w:t>}}</w:t>
+              <w:t>{{log_path}}</w:t>
             </w:r>
           </w:p>
         </w:tc>
@@ -6960,25 +5123,7 @@
           <w:sz w:val="26"/>
           <w:szCs w:val="26"/>
         </w:rPr>
-        <w:t>&lt;</w:t>
-      </w:r>
-      <w:proofErr w:type="spellStart"/>
-      <w:r>
-        <w:rPr>
-          <w:rFonts w:cstheme="minorHAnsi"/>
-          <w:sz w:val="26"/>
-          <w:szCs w:val="26"/>
-        </w:rPr>
-        <w:t>file_size</w:t>
-      </w:r>
-      <w:proofErr w:type="spellEnd"/>
-      <w:r>
-        <w:rPr>
-          <w:rFonts w:cstheme="minorHAnsi"/>
-          <w:sz w:val="26"/>
-          <w:szCs w:val="26"/>
-        </w:rPr>
-        <w:t>&gt;</w:t>
+        <w:t>&lt;file_size&gt;</w:t>
       </w:r>
     </w:p>
     <w:bookmarkEnd w:id="18"/>
@@ -7065,25 +5210,7 @@
           <w:sz w:val="26"/>
           <w:szCs w:val="26"/>
         </w:rPr>
-        <w:t>&lt;</w:t>
-      </w:r>
-      <w:proofErr w:type="spellStart"/>
-      <w:r>
-        <w:rPr>
-          <w:rFonts w:cstheme="minorHAnsi"/>
-          <w:sz w:val="26"/>
-          <w:szCs w:val="26"/>
-        </w:rPr>
-        <w:t>fileio</w:t>
-      </w:r>
-      <w:proofErr w:type="spellEnd"/>
-      <w:r>
-        <w:rPr>
-          <w:rFonts w:cstheme="minorHAnsi"/>
-          <w:sz w:val="26"/>
-          <w:szCs w:val="26"/>
-        </w:rPr>
-        <w:t>&gt;</w:t>
+        <w:t>&lt;fileio&gt;</w:t>
       </w:r>
     </w:p>
     <w:p>
@@ -7190,25 +5317,7 @@
           <w:sz w:val="26"/>
           <w:szCs w:val="26"/>
         </w:rPr>
-        <w:t>&lt;</w:t>
-      </w:r>
-      <w:proofErr w:type="spellStart"/>
-      <w:r>
-        <w:rPr>
-          <w:rFonts w:cstheme="minorHAnsi"/>
-          <w:sz w:val="26"/>
-          <w:szCs w:val="26"/>
-        </w:rPr>
-        <w:t>conn_count</w:t>
-      </w:r>
-      <w:proofErr w:type="spellEnd"/>
-      <w:r>
-        <w:rPr>
-          <w:rFonts w:cstheme="minorHAnsi"/>
-          <w:sz w:val="26"/>
-          <w:szCs w:val="26"/>
-        </w:rPr>
-        <w:t>&gt;</w:t>
+        <w:t>&lt;conn_count&gt;</w:t>
       </w:r>
     </w:p>
     <w:p>
@@ -7303,23 +5412,7 @@
           <w:sz w:val="26"/>
           <w:szCs w:val="26"/>
         </w:rPr>
-        <w:t>&lt;</w:t>
-      </w:r>
-      <w:proofErr w:type="spellStart"/>
-      <w:r>
-        <w:rPr>
-          <w:sz w:val="26"/>
-          <w:szCs w:val="26"/>
-        </w:rPr>
-        <w:t>cpu_usage</w:t>
-      </w:r>
-      <w:proofErr w:type="spellEnd"/>
-      <w:r>
-        <w:rPr>
-          <w:sz w:val="26"/>
-          <w:szCs w:val="26"/>
-        </w:rPr>
-        <w:t>&gt;</w:t>
+        <w:t>&lt;cpu_usage&gt;</w:t>
       </w:r>
     </w:p>
     <w:p>
@@ -7350,23 +5443,7 @@
           <w:sz w:val="26"/>
           <w:szCs w:val="26"/>
         </w:rPr>
-        <w:t>&lt;</w:t>
-      </w:r>
-      <w:proofErr w:type="spellStart"/>
-      <w:r>
-        <w:rPr>
-          <w:sz w:val="26"/>
-          <w:szCs w:val="26"/>
-        </w:rPr>
-        <w:t>cpu_chart</w:t>
-      </w:r>
-      <w:proofErr w:type="spellEnd"/>
-      <w:r>
-        <w:rPr>
-          <w:sz w:val="26"/>
-          <w:szCs w:val="26"/>
-        </w:rPr>
-        <w:t>&gt;</w:t>
+        <w:t>&lt;cpu_chart&gt;</w:t>
       </w:r>
     </w:p>
     <w:p>
@@ -7506,25 +5583,7 @@
           <w:sz w:val="26"/>
           <w:szCs w:val="26"/>
         </w:rPr>
-        <w:t>&lt;</w:t>
-      </w:r>
-      <w:proofErr w:type="spellStart"/>
-      <w:r>
-        <w:rPr>
-          <w:rFonts w:cstheme="minorHAnsi"/>
-          <w:sz w:val="26"/>
-          <w:szCs w:val="26"/>
-        </w:rPr>
-        <w:t>io_usage</w:t>
-      </w:r>
-      <w:proofErr w:type="spellEnd"/>
-      <w:r>
-        <w:rPr>
-          <w:rFonts w:cstheme="minorHAnsi"/>
-          <w:sz w:val="26"/>
-          <w:szCs w:val="26"/>
-        </w:rPr>
-        <w:t>&gt;</w:t>
+        <w:t>&lt;io_usage&gt;</w:t>
       </w:r>
     </w:p>
     <w:p>
@@ -7550,25 +5609,7 @@
           <w:sz w:val="26"/>
           <w:szCs w:val="26"/>
         </w:rPr>
-        <w:t>&lt;</w:t>
-      </w:r>
-      <w:proofErr w:type="spellStart"/>
-      <w:r>
-        <w:rPr>
-          <w:rFonts w:cstheme="minorHAnsi"/>
-          <w:sz w:val="26"/>
-          <w:szCs w:val="26"/>
-        </w:rPr>
-        <w:t>io_chart</w:t>
-      </w:r>
-      <w:proofErr w:type="spellEnd"/>
-      <w:r>
-        <w:rPr>
-          <w:rFonts w:cstheme="minorHAnsi"/>
-          <w:sz w:val="26"/>
-          <w:szCs w:val="26"/>
-        </w:rPr>
-        <w:t>&gt;</w:t>
+        <w:t>&lt;io_chart&gt;</w:t>
       </w:r>
     </w:p>
     <w:p>
@@ -7716,25 +5757,7 @@
           <w:sz w:val="26"/>
           <w:szCs w:val="26"/>
         </w:rPr>
-        <w:t>&lt;</w:t>
-      </w:r>
-      <w:proofErr w:type="spellStart"/>
-      <w:r>
-        <w:rPr>
-          <w:rFonts w:cstheme="minorHAnsi"/>
-          <w:sz w:val="26"/>
-          <w:szCs w:val="26"/>
-        </w:rPr>
-        <w:t>buffer_usage</w:t>
-      </w:r>
-      <w:proofErr w:type="spellEnd"/>
-      <w:r>
-        <w:rPr>
-          <w:rFonts w:cstheme="minorHAnsi"/>
-          <w:sz w:val="26"/>
-          <w:szCs w:val="26"/>
-        </w:rPr>
-        <w:t>&gt;</w:t>
+        <w:t>&lt;buffer_usage&gt;</w:t>
       </w:r>
     </w:p>
     <w:p>
@@ -7769,25 +5792,7 @@
           <w:sz w:val="26"/>
           <w:szCs w:val="26"/>
         </w:rPr>
-        <w:t>&lt;</w:t>
-      </w:r>
-      <w:proofErr w:type="spellStart"/>
-      <w:r>
-        <w:rPr>
-          <w:rFonts w:cstheme="minorHAnsi"/>
-          <w:sz w:val="26"/>
-          <w:szCs w:val="26"/>
-        </w:rPr>
-        <w:t>buffer_chart</w:t>
-      </w:r>
-      <w:proofErr w:type="spellEnd"/>
-      <w:r>
-        <w:rPr>
-          <w:rFonts w:cstheme="minorHAnsi"/>
-          <w:sz w:val="26"/>
-          <w:szCs w:val="26"/>
-        </w:rPr>
-        <w:t>&gt;</w:t>
+        <w:t>&lt;buffer_chart&gt;</w:t>
       </w:r>
     </w:p>
     <w:p>
@@ -7949,25 +5954,7 @@
           <w:sz w:val="26"/>
           <w:szCs w:val="26"/>
         </w:rPr>
-        <w:t>&lt;</w:t>
-      </w:r>
-      <w:proofErr w:type="spellStart"/>
-      <w:r>
-        <w:rPr>
-          <w:rFonts w:cstheme="minorHAnsi"/>
-          <w:sz w:val="26"/>
-          <w:szCs w:val="26"/>
-        </w:rPr>
-        <w:t>top_worker</w:t>
-      </w:r>
-      <w:proofErr w:type="spellEnd"/>
-      <w:r>
-        <w:rPr>
-          <w:rFonts w:cstheme="minorHAnsi"/>
-          <w:sz w:val="26"/>
-          <w:szCs w:val="26"/>
-        </w:rPr>
-        <w:t>&gt;</w:t>
+        <w:t>&lt;top_worker&gt;</w:t>
       </w:r>
     </w:p>
     <w:p/>
@@ -8019,15 +6006,7 @@
     </w:p>
     <w:p>
       <w:r>
-        <w:t>&lt;</w:t>
-      </w:r>
-      <w:proofErr w:type="spellStart"/>
-      <w:r>
-        <w:t>missing_index</w:t>
-      </w:r>
-      <w:proofErr w:type="spellEnd"/>
-      <w:r>
-        <w:t>&gt;</w:t>
+        <w:t>&lt;missing_index&gt;</w:t>
       </w:r>
     </w:p>
     <w:p>
@@ -8060,15 +6039,7 @@
     </w:p>
     <w:p>
       <w:r>
-        <w:t>&lt;</w:t>
-      </w:r>
-      <w:proofErr w:type="spellStart"/>
-      <w:r>
-        <w:t>agent_job</w:t>
-      </w:r>
-      <w:proofErr w:type="spellEnd"/>
-      <w:r>
-        <w:t>&gt;</w:t>
+        <w:t>&lt;agent_job&gt;</w:t>
       </w:r>
     </w:p>
     <w:p/>
@@ -8134,21 +6105,7 @@
         <w:rPr>
           <w:rFonts w:cs="Arial"/>
         </w:rPr>
-        <w:t>&lt;</w:t>
-      </w:r>
-      <w:proofErr w:type="spellStart"/>
-      <w:r>
-        <w:rPr>
-          <w:rFonts w:cs="Arial"/>
-        </w:rPr>
-        <w:t>recent_bk</w:t>
-      </w:r>
-      <w:proofErr w:type="spellEnd"/>
-      <w:r>
-        <w:rPr>
-          <w:rFonts w:cs="Arial"/>
-        </w:rPr>
-        <w:t>&gt;</w:t>
+        <w:t>&lt;recent_bk&gt;</w:t>
       </w:r>
     </w:p>
     <w:p>
@@ -8224,21 +6181,7 @@
       <w:rPr>
         <w:bCs/>
       </w:rPr>
-      <w:t>&lt;</w:t>
-    </w:r>
-    <w:proofErr w:type="spellStart"/>
-    <w:r>
-      <w:rPr>
-        <w:bCs/>
-      </w:rPr>
-      <w:t>collect_date</w:t>
-    </w:r>
-    <w:proofErr w:type="spellEnd"/>
-    <w:r>
-      <w:rPr>
-        <w:bCs/>
-      </w:rPr>
-      <w:t>&gt;</w:t>
+      <w:t>&lt;collect_date&gt;</w:t>
     </w:r>
     <w:r>
       <w:tab/>
@@ -8310,15 +6253,7 @@
       <w:t xml:space="preserve"> </w:t>
     </w:r>
     <w:r>
-      <w:t>&lt;</w:t>
-    </w:r>
-    <w:proofErr w:type="spellStart"/>
-    <w:r>
-      <w:t>collect_date</w:t>
-    </w:r>
-    <w:proofErr w:type="spellEnd"/>
-    <w:r>
-      <w:t>&gt;</w:t>
+      <w:t>&lt;collect_date&gt;</w:t>
     </w:r>
     <w:r>
       <w:tab/>

</xml_diff>